<commit_message>
feat: update for IEEE Reference Guide version 11.29.2023
</commit_message>
<xml_diff>
--- a/IEEE_examples.docx
+++ b/IEEE_examples.docx
@@ -1396,6 +1396,24 @@
       <w14:ligatures w14:val="none"/>
     </w:rPr>
   </w:style>
+  <w:style w:type="paragraph" w:styleId="Bibliography">
+    <w:name w:val="Bibliography"/>
+    <w:basedOn w:val="Normal"/>
+    <w:next w:val="Normal"/>
+    <w:uiPriority w:val="37"/>
+    <w:unhideWhenUsed/>
+    <w:rsid w:val="00415E73"/>
+  </w:style>
+  <w:style w:type="paragraph" w:styleId="Revision">
+    <w:name w:val="Revision"/>
+    <w:hidden/>
+    <w:uiPriority w:val="99"/>
+    <w:semiHidden/>
+    <w:rsid w:val="00415E73"/>
+    <w:pPr>
+      <w:spacing w:after="0" w:line="240" w:lineRule="auto"/>
+    </w:pPr>
+  </w:style>
 </w:styles>
 </file>
 
@@ -1695,7 +1713,7 @@
 </file>
 
 <file path=customXml/item1.xml><?xml version="1.0" encoding="utf-8"?>
-<b:Sources xmlns:b="http://schemas.openxmlformats.org/officeDocument/2006/bibliography" xmlns="http://schemas.openxmlformats.org/officeDocument/2006/bibliography" SelectedStyle="\ieee.xsl" StyleName="IEEE Reference Guide version 11.29.2023" Version="1.0">
+<b:Sources xmlns:b="http://schemas.openxmlformats.org/officeDocument/2006/bibliography" xmlns="http://schemas.openxmlformats.org/officeDocument/2006/bibliography" SelectedStyle="\IEEE2006OfficeOnline.xsl" StyleName="IEEE" Version="2006">
   <b:Source>
     <b:Tag>Pat23</b:Tag>
     <b:SourceType>JournalArticle</b:SourceType>
@@ -1781,7 +1799,7 @@
 </file>
 
 <file path=customXml/itemProps1.xml><?xml version="1.0" encoding="utf-8"?>
-<ds:datastoreItem xmlns:ds="http://schemas.openxmlformats.org/officeDocument/2006/customXml" ds:itemID="{8C1FF284-825A-4598-AF32-E0B77908AD81}">
+<ds:datastoreItem xmlns:ds="http://schemas.openxmlformats.org/officeDocument/2006/customXml" ds:itemID="{468B6B28-A9A9-4D6C-96E2-D2159B1F6182}">
   <ds:schemaRefs>
     <ds:schemaRef ds:uri="http://schemas.openxmlformats.org/officeDocument/2006/bibliography"/>
   </ds:schemaRefs>

</xml_diff>